<commit_message>
docs: record F1.3 and F1.4 as done, add V11 and its config
- 09 功能矩阵: F1.3 退出 and F1.4 改密 are implemented, so the conclusion goes
  from 21/22 to all 22. Both rows leave the open-risk table; the remaining gap
  is reframed as 'blacklist only covers the revoked token, other devices stay
  valid until expiry'
- 04 gains 15.11 with the three blacklist trade-offs (DB vs memory, cache vs
  per-request query, hash vs raw token) and the password rules plus why the old
  password is mandatory
- 05 documents revoked_token as 7.4
- 07 adds V11 to the upgrade steps and the two cleanup config keys
- docx for these four regenerated with the md2docx-libreoffice skill
</commit_message>
<xml_diff>
--- a/docs/word/04-详细设计说明书.docx
+++ b/docs/word/04-详细设计说明书.docx
@@ -12939,7 +12939,7 @@
     </w:p>
     <w:tbl>
       <w:tblPr>
-        <w:tblW w:w="6433" w:type="dxa"/>
+        <w:tblW w:w="11339" w:type="dxa"/>
         <w:jc w:val="left"/>
         <w:tblInd w:w="28" w:type="dxa"/>
         <w:tblLayout w:type="fixed"/>
@@ -12951,14 +12951,18 @@
         </w:tblCellMar>
       </w:tblPr>
       <w:tblGrid>
-        <w:gridCol w:w="1228"/>
-        <w:gridCol w:w="5205"/>
+        <w:gridCol w:w="1208"/>
+        <w:gridCol w:w="5080"/>
+        <w:gridCol w:w="317"/>
+        <w:gridCol w:w="2671"/>
+        <w:gridCol w:w="317"/>
+        <w:gridCol w:w="1746"/>
       </w:tblGrid>
       <w:tr>
         <w:trPr/>
         <w:tc>
           <w:tcPr>
-            <w:tcW w:w="1228" w:type="dxa"/>
+            <w:tcW w:w="1208" w:type="dxa"/>
             <w:tcBorders/>
             <w:vAlign w:val="center"/>
           </w:tcPr>
@@ -12980,7 +12984,7 @@
         </w:tc>
         <w:tc>
           <w:tcPr>
-            <w:tcW w:w="5205" w:type="dxa"/>
+            <w:tcW w:w="5080" w:type="dxa"/>
             <w:tcBorders/>
             <w:vAlign w:val="center"/>
           </w:tcPr>
@@ -13000,12 +13004,108 @@
             </w:r>
           </w:p>
         </w:tc>
+        <w:tc>
+          <w:tcPr>
+            <w:tcW w:w="317" w:type="dxa"/>
+            <w:tcBorders/>
+          </w:tcPr>
+          <w:p>
+            <w:pPr>
+              <w:pStyle w:val="Style14"/>
+              <w:bidi w:val="0"/>
+              <w:spacing w:before="0" w:after="283"/>
+              <w:jc w:val="left"/>
+              <w:rPr>
+                <w:sz w:val="4"/>
+                <w:szCs w:val="4"/>
+              </w:rPr>
+            </w:pPr>
+            <w:r>
+              <w:rPr>
+                <w:sz w:val="4"/>
+                <w:szCs w:val="4"/>
+              </w:rPr>
+            </w:r>
+          </w:p>
+        </w:tc>
+        <w:tc>
+          <w:tcPr>
+            <w:tcW w:w="2671" w:type="dxa"/>
+            <w:tcBorders/>
+          </w:tcPr>
+          <w:p>
+            <w:pPr>
+              <w:pStyle w:val="Style14"/>
+              <w:bidi w:val="0"/>
+              <w:spacing w:before="0" w:after="283"/>
+              <w:jc w:val="left"/>
+              <w:rPr>
+                <w:sz w:val="4"/>
+                <w:szCs w:val="4"/>
+              </w:rPr>
+            </w:pPr>
+            <w:r>
+              <w:rPr>
+                <w:sz w:val="4"/>
+                <w:szCs w:val="4"/>
+              </w:rPr>
+            </w:r>
+          </w:p>
+        </w:tc>
+        <w:tc>
+          <w:tcPr>
+            <w:tcW w:w="317" w:type="dxa"/>
+            <w:tcBorders/>
+          </w:tcPr>
+          <w:p>
+            <w:pPr>
+              <w:pStyle w:val="Style14"/>
+              <w:bidi w:val="0"/>
+              <w:spacing w:before="0" w:after="283"/>
+              <w:jc w:val="left"/>
+              <w:rPr>
+                <w:sz w:val="4"/>
+                <w:szCs w:val="4"/>
+              </w:rPr>
+            </w:pPr>
+            <w:r>
+              <w:rPr>
+                <w:sz w:val="4"/>
+                <w:szCs w:val="4"/>
+              </w:rPr>
+            </w:r>
+          </w:p>
+        </w:tc>
+        <w:tc>
+          <w:tcPr>
+            <w:tcW w:w="1746" w:type="dxa"/>
+            <w:tcBorders/>
+          </w:tcPr>
+          <w:p>
+            <w:pPr>
+              <w:pStyle w:val="Style14"/>
+              <w:bidi w:val="0"/>
+              <w:spacing w:before="0" w:after="283"/>
+              <w:jc w:val="left"/>
+              <w:rPr>
+                <w:sz w:val="4"/>
+                <w:szCs w:val="4"/>
+              </w:rPr>
+            </w:pPr>
+            <w:r>
+              <w:rPr>
+                <w:sz w:val="4"/>
+                <w:szCs w:val="4"/>
+              </w:rPr>
+            </w:r>
+          </w:p>
+        </w:tc>
       </w:tr>
       <w:tr>
         <w:trPr/>
         <w:tc>
           <w:tcPr>
-            <w:tcW w:w="1228" w:type="dxa"/>
+            <w:tcW w:w="1208" w:type="dxa"/>
             <w:tcBorders/>
             <w:vAlign w:val="center"/>
           </w:tcPr>
@@ -13033,7 +13133,7 @@
         </w:tc>
         <w:tc>
           <w:tcPr>
-            <w:tcW w:w="5205" w:type="dxa"/>
+            <w:tcW w:w="5080" w:type="dxa"/>
             <w:tcBorders/>
             <w:vAlign w:val="center"/>
           </w:tcPr>
@@ -13075,12 +13175,108 @@
             </w:r>
           </w:p>
         </w:tc>
+        <w:tc>
+          <w:tcPr>
+            <w:tcW w:w="317" w:type="dxa"/>
+            <w:tcBorders/>
+          </w:tcPr>
+          <w:p>
+            <w:pPr>
+              <w:pStyle w:val="Style14"/>
+              <w:bidi w:val="0"/>
+              <w:spacing w:before="0" w:after="283"/>
+              <w:jc w:val="left"/>
+              <w:rPr>
+                <w:sz w:val="4"/>
+                <w:szCs w:val="4"/>
+              </w:rPr>
+            </w:pPr>
+            <w:r>
+              <w:rPr>
+                <w:sz w:val="4"/>
+                <w:szCs w:val="4"/>
+              </w:rPr>
+            </w:r>
+          </w:p>
+        </w:tc>
+        <w:tc>
+          <w:tcPr>
+            <w:tcW w:w="2671" w:type="dxa"/>
+            <w:tcBorders/>
+          </w:tcPr>
+          <w:p>
+            <w:pPr>
+              <w:pStyle w:val="Style14"/>
+              <w:bidi w:val="0"/>
+              <w:spacing w:before="0" w:after="283"/>
+              <w:jc w:val="left"/>
+              <w:rPr>
+                <w:sz w:val="4"/>
+                <w:szCs w:val="4"/>
+              </w:rPr>
+            </w:pPr>
+            <w:r>
+              <w:rPr>
+                <w:sz w:val="4"/>
+                <w:szCs w:val="4"/>
+              </w:rPr>
+            </w:r>
+          </w:p>
+        </w:tc>
+        <w:tc>
+          <w:tcPr>
+            <w:tcW w:w="317" w:type="dxa"/>
+            <w:tcBorders/>
+          </w:tcPr>
+          <w:p>
+            <w:pPr>
+              <w:pStyle w:val="Style14"/>
+              <w:bidi w:val="0"/>
+              <w:spacing w:before="0" w:after="283"/>
+              <w:jc w:val="left"/>
+              <w:rPr>
+                <w:sz w:val="4"/>
+                <w:szCs w:val="4"/>
+              </w:rPr>
+            </w:pPr>
+            <w:r>
+              <w:rPr>
+                <w:sz w:val="4"/>
+                <w:szCs w:val="4"/>
+              </w:rPr>
+            </w:r>
+          </w:p>
+        </w:tc>
+        <w:tc>
+          <w:tcPr>
+            <w:tcW w:w="1746" w:type="dxa"/>
+            <w:tcBorders/>
+          </w:tcPr>
+          <w:p>
+            <w:pPr>
+              <w:pStyle w:val="Style14"/>
+              <w:bidi w:val="0"/>
+              <w:spacing w:before="0" w:after="283"/>
+              <w:jc w:val="left"/>
+              <w:rPr>
+                <w:sz w:val="4"/>
+                <w:szCs w:val="4"/>
+              </w:rPr>
+            </w:pPr>
+            <w:r>
+              <w:rPr>
+                <w:sz w:val="4"/>
+                <w:szCs w:val="4"/>
+              </w:rPr>
+            </w:r>
+          </w:p>
+        </w:tc>
       </w:tr>
       <w:tr>
         <w:trPr/>
         <w:tc>
           <w:tcPr>
-            <w:tcW w:w="1228" w:type="dxa"/>
+            <w:tcW w:w="1208" w:type="dxa"/>
             <w:tcBorders/>
             <w:vAlign w:val="center"/>
           </w:tcPr>
@@ -13100,7 +13296,7 @@
         </w:tc>
         <w:tc>
           <w:tcPr>
-            <w:tcW w:w="5205" w:type="dxa"/>
+            <w:tcW w:w="5080" w:type="dxa"/>
             <w:tcBorders/>
             <w:vAlign w:val="center"/>
           </w:tcPr>
@@ -13131,6 +13327,102 @@
             <w:r>
               <w:rPr/>
               <w:t>（提前返回，省一次开方）</w:t>
+            </w:r>
+          </w:p>
+        </w:tc>
+        <w:tc>
+          <w:tcPr>
+            <w:tcW w:w="317" w:type="dxa"/>
+            <w:tcBorders/>
+          </w:tcPr>
+          <w:p>
+            <w:pPr>
+              <w:pStyle w:val="Style14"/>
+              <w:bidi w:val="0"/>
+              <w:spacing w:before="0" w:after="283"/>
+              <w:jc w:val="left"/>
+              <w:rPr>
+                <w:sz w:val="4"/>
+                <w:szCs w:val="4"/>
+              </w:rPr>
+            </w:pPr>
+            <w:r>
+              <w:rPr>
+                <w:sz w:val="4"/>
+                <w:szCs w:val="4"/>
+              </w:rPr>
+            </w:r>
+          </w:p>
+        </w:tc>
+        <w:tc>
+          <w:tcPr>
+            <w:tcW w:w="2671" w:type="dxa"/>
+            <w:tcBorders/>
+          </w:tcPr>
+          <w:p>
+            <w:pPr>
+              <w:pStyle w:val="Style14"/>
+              <w:bidi w:val="0"/>
+              <w:spacing w:before="0" w:after="283"/>
+              <w:jc w:val="left"/>
+              <w:rPr>
+                <w:sz w:val="4"/>
+                <w:szCs w:val="4"/>
+              </w:rPr>
+            </w:pPr>
+            <w:r>
+              <w:rPr>
+                <w:sz w:val="4"/>
+                <w:szCs w:val="4"/>
+              </w:rPr>
+            </w:r>
+          </w:p>
+        </w:tc>
+        <w:tc>
+          <w:tcPr>
+            <w:tcW w:w="317" w:type="dxa"/>
+            <w:tcBorders/>
+          </w:tcPr>
+          <w:p>
+            <w:pPr>
+              <w:pStyle w:val="Style14"/>
+              <w:bidi w:val="0"/>
+              <w:spacing w:before="0" w:after="283"/>
+              <w:jc w:val="left"/>
+              <w:rPr>
+                <w:sz w:val="4"/>
+                <w:szCs w:val="4"/>
+              </w:rPr>
+            </w:pPr>
+            <w:r>
+              <w:rPr>
+                <w:sz w:val="4"/>
+                <w:szCs w:val="4"/>
+              </w:rPr>
+            </w:r>
+          </w:p>
+        </w:tc>
+        <w:tc>
+          <w:tcPr>
+            <w:tcW w:w="1746" w:type="dxa"/>
+            <w:tcBorders/>
+          </w:tcPr>
+          <w:p>
+            <w:pPr>
+              <w:pStyle w:val="Style14"/>
+              <w:bidi w:val="0"/>
+              <w:spacing w:before="0" w:after="283"/>
+              <w:jc w:val="left"/>
+              <w:rPr>
+                <w:sz w:val="4"/>
+                <w:szCs w:val="4"/>
+              </w:rPr>
+            </w:pPr>
+            <w:r>
+              <w:rPr>
+                <w:sz w:val="4"/>
+                <w:szCs w:val="4"/>
+              </w:rPr>
             </w:r>
           </w:p>
         </w:tc>
@@ -13139,7 +13431,7 @@
         <w:trPr/>
         <w:tc>
           <w:tcPr>
-            <w:tcW w:w="1228" w:type="dxa"/>
+            <w:tcW w:w="1208" w:type="dxa"/>
             <w:tcBorders/>
             <w:vAlign w:val="center"/>
           </w:tcPr>
@@ -13159,7 +13451,7 @@
         </w:tc>
         <w:tc>
           <w:tcPr>
-            <w:tcW w:w="5205" w:type="dxa"/>
+            <w:tcW w:w="5080" w:type="dxa"/>
             <w:tcBorders/>
             <w:vAlign w:val="center"/>
           </w:tcPr>
@@ -13178,6 +13470,102 @@
             <w:r>
               <w:rPr/>
               <w:t>key</w:t>
+            </w:r>
+          </w:p>
+        </w:tc>
+        <w:tc>
+          <w:tcPr>
+            <w:tcW w:w="317" w:type="dxa"/>
+            <w:tcBorders/>
+          </w:tcPr>
+          <w:p>
+            <w:pPr>
+              <w:pStyle w:val="Style14"/>
+              <w:bidi w:val="0"/>
+              <w:spacing w:before="0" w:after="283"/>
+              <w:jc w:val="left"/>
+              <w:rPr>
+                <w:sz w:val="4"/>
+                <w:szCs w:val="4"/>
+              </w:rPr>
+            </w:pPr>
+            <w:r>
+              <w:rPr>
+                <w:sz w:val="4"/>
+                <w:szCs w:val="4"/>
+              </w:rPr>
+            </w:r>
+          </w:p>
+        </w:tc>
+        <w:tc>
+          <w:tcPr>
+            <w:tcW w:w="2671" w:type="dxa"/>
+            <w:tcBorders/>
+          </w:tcPr>
+          <w:p>
+            <w:pPr>
+              <w:pStyle w:val="Style14"/>
+              <w:bidi w:val="0"/>
+              <w:spacing w:before="0" w:after="283"/>
+              <w:jc w:val="left"/>
+              <w:rPr>
+                <w:sz w:val="4"/>
+                <w:szCs w:val="4"/>
+              </w:rPr>
+            </w:pPr>
+            <w:r>
+              <w:rPr>
+                <w:sz w:val="4"/>
+                <w:szCs w:val="4"/>
+              </w:rPr>
+            </w:r>
+          </w:p>
+        </w:tc>
+        <w:tc>
+          <w:tcPr>
+            <w:tcW w:w="317" w:type="dxa"/>
+            <w:tcBorders/>
+          </w:tcPr>
+          <w:p>
+            <w:pPr>
+              <w:pStyle w:val="Style14"/>
+              <w:bidi w:val="0"/>
+              <w:spacing w:before="0" w:after="283"/>
+              <w:jc w:val="left"/>
+              <w:rPr>
+                <w:sz w:val="4"/>
+                <w:szCs w:val="4"/>
+              </w:rPr>
+            </w:pPr>
+            <w:r>
+              <w:rPr>
+                <w:sz w:val="4"/>
+                <w:szCs w:val="4"/>
+              </w:rPr>
+            </w:r>
+          </w:p>
+        </w:tc>
+        <w:tc>
+          <w:tcPr>
+            <w:tcW w:w="1746" w:type="dxa"/>
+            <w:tcBorders/>
+          </w:tcPr>
+          <w:p>
+            <w:pPr>
+              <w:pStyle w:val="Style14"/>
+              <w:bidi w:val="0"/>
+              <w:spacing w:before="0" w:after="283"/>
+              <w:jc w:val="left"/>
+              <w:rPr>
+                <w:sz w:val="4"/>
+                <w:szCs w:val="4"/>
+              </w:rPr>
+            </w:pPr>
+            <w:r>
+              <w:rPr>
+                <w:sz w:val="4"/>
+                <w:szCs w:val="4"/>
+              </w:rPr>
             </w:r>
           </w:p>
         </w:tc>
@@ -13186,7 +13574,7 @@
         <w:trPr/>
         <w:tc>
           <w:tcPr>
-            <w:tcW w:w="1228" w:type="dxa"/>
+            <w:tcW w:w="1208" w:type="dxa"/>
             <w:tcBorders/>
             <w:vAlign w:val="center"/>
           </w:tcPr>
@@ -13206,7 +13594,7 @@
         </w:tc>
         <w:tc>
           <w:tcPr>
-            <w:tcW w:w="5205" w:type="dxa"/>
+            <w:tcW w:w="5080" w:type="dxa"/>
             <w:tcBorders/>
             <w:vAlign w:val="center"/>
           </w:tcPr>
@@ -13233,6 +13621,102 @@
             <w:r>
               <w:rPr/>
               <w:t>`0.0`</w:t>
+            </w:r>
+          </w:p>
+        </w:tc>
+        <w:tc>
+          <w:tcPr>
+            <w:tcW w:w="317" w:type="dxa"/>
+            <w:tcBorders/>
+          </w:tcPr>
+          <w:p>
+            <w:pPr>
+              <w:pStyle w:val="Style14"/>
+              <w:bidi w:val="0"/>
+              <w:spacing w:before="0" w:after="283"/>
+              <w:jc w:val="left"/>
+              <w:rPr>
+                <w:sz w:val="4"/>
+                <w:szCs w:val="4"/>
+              </w:rPr>
+            </w:pPr>
+            <w:r>
+              <w:rPr>
+                <w:sz w:val="4"/>
+                <w:szCs w:val="4"/>
+              </w:rPr>
+            </w:r>
+          </w:p>
+        </w:tc>
+        <w:tc>
+          <w:tcPr>
+            <w:tcW w:w="2671" w:type="dxa"/>
+            <w:tcBorders/>
+          </w:tcPr>
+          <w:p>
+            <w:pPr>
+              <w:pStyle w:val="Style14"/>
+              <w:bidi w:val="0"/>
+              <w:spacing w:before="0" w:after="283"/>
+              <w:jc w:val="left"/>
+              <w:rPr>
+                <w:sz w:val="4"/>
+                <w:szCs w:val="4"/>
+              </w:rPr>
+            </w:pPr>
+            <w:r>
+              <w:rPr>
+                <w:sz w:val="4"/>
+                <w:szCs w:val="4"/>
+              </w:rPr>
+            </w:r>
+          </w:p>
+        </w:tc>
+        <w:tc>
+          <w:tcPr>
+            <w:tcW w:w="317" w:type="dxa"/>
+            <w:tcBorders/>
+          </w:tcPr>
+          <w:p>
+            <w:pPr>
+              <w:pStyle w:val="Style14"/>
+              <w:bidi w:val="0"/>
+              <w:spacing w:before="0" w:after="283"/>
+              <w:jc w:val="left"/>
+              <w:rPr>
+                <w:sz w:val="4"/>
+                <w:szCs w:val="4"/>
+              </w:rPr>
+            </w:pPr>
+            <w:r>
+              <w:rPr>
+                <w:sz w:val="4"/>
+                <w:szCs w:val="4"/>
+              </w:rPr>
+            </w:r>
+          </w:p>
+        </w:tc>
+        <w:tc>
+          <w:tcPr>
+            <w:tcW w:w="1746" w:type="dxa"/>
+            <w:tcBorders/>
+          </w:tcPr>
+          <w:p>
+            <w:pPr>
+              <w:pStyle w:val="Style14"/>
+              <w:bidi w:val="0"/>
+              <w:spacing w:before="0" w:after="283"/>
+              <w:jc w:val="left"/>
+              <w:rPr>
+                <w:sz w:val="4"/>
+                <w:szCs w:val="4"/>
+              </w:rPr>
+            </w:pPr>
+            <w:r>
+              <w:rPr>
+                <w:sz w:val="4"/>
+                <w:szCs w:val="4"/>
+              </w:rPr>
             </w:r>
           </w:p>
         </w:tc>
@@ -13241,7 +13725,7 @@
         <w:trPr/>
         <w:tc>
           <w:tcPr>
-            <w:tcW w:w="1228" w:type="dxa"/>
+            <w:tcW w:w="1208" w:type="dxa"/>
             <w:tcBorders/>
             <w:vAlign w:val="center"/>
           </w:tcPr>
@@ -13261,7 +13745,7 @@
         </w:tc>
         <w:tc>
           <w:tcPr>
-            <w:tcW w:w="5205" w:type="dxa"/>
+            <w:tcW w:w="5080" w:type="dxa"/>
             <w:tcBorders/>
             <w:vAlign w:val="center"/>
           </w:tcPr>
@@ -13288,6 +13772,102 @@
             <w:r>
               <w:rPr/>
               <w:t>[0,1]</w:t>
+            </w:r>
+          </w:p>
+        </w:tc>
+        <w:tc>
+          <w:tcPr>
+            <w:tcW w:w="317" w:type="dxa"/>
+            <w:tcBorders/>
+          </w:tcPr>
+          <w:p>
+            <w:pPr>
+              <w:pStyle w:val="Style14"/>
+              <w:bidi w:val="0"/>
+              <w:spacing w:before="0" w:after="283"/>
+              <w:jc w:val="left"/>
+              <w:rPr>
+                <w:sz w:val="4"/>
+                <w:szCs w:val="4"/>
+              </w:rPr>
+            </w:pPr>
+            <w:r>
+              <w:rPr>
+                <w:sz w:val="4"/>
+                <w:szCs w:val="4"/>
+              </w:rPr>
+            </w:r>
+          </w:p>
+        </w:tc>
+        <w:tc>
+          <w:tcPr>
+            <w:tcW w:w="2671" w:type="dxa"/>
+            <w:tcBorders/>
+          </w:tcPr>
+          <w:p>
+            <w:pPr>
+              <w:pStyle w:val="Style14"/>
+              <w:bidi w:val="0"/>
+              <w:spacing w:before="0" w:after="283"/>
+              <w:jc w:val="left"/>
+              <w:rPr>
+                <w:sz w:val="4"/>
+                <w:szCs w:val="4"/>
+              </w:rPr>
+            </w:pPr>
+            <w:r>
+              <w:rPr>
+                <w:sz w:val="4"/>
+                <w:szCs w:val="4"/>
+              </w:rPr>
+            </w:r>
+          </w:p>
+        </w:tc>
+        <w:tc>
+          <w:tcPr>
+            <w:tcW w:w="317" w:type="dxa"/>
+            <w:tcBorders/>
+          </w:tcPr>
+          <w:p>
+            <w:pPr>
+              <w:pStyle w:val="Style14"/>
+              <w:bidi w:val="0"/>
+              <w:spacing w:before="0" w:after="283"/>
+              <w:jc w:val="left"/>
+              <w:rPr>
+                <w:sz w:val="4"/>
+                <w:szCs w:val="4"/>
+              </w:rPr>
+            </w:pPr>
+            <w:r>
+              <w:rPr>
+                <w:sz w:val="4"/>
+                <w:szCs w:val="4"/>
+              </w:rPr>
+            </w:r>
+          </w:p>
+        </w:tc>
+        <w:tc>
+          <w:tcPr>
+            <w:tcW w:w="1746" w:type="dxa"/>
+            <w:tcBorders/>
+          </w:tcPr>
+          <w:p>
+            <w:pPr>
+              <w:pStyle w:val="Style14"/>
+              <w:bidi w:val="0"/>
+              <w:spacing w:before="0" w:after="283"/>
+              <w:jc w:val="left"/>
+              <w:rPr>
+                <w:sz w:val="4"/>
+                <w:szCs w:val="4"/>
+              </w:rPr>
+            </w:pPr>
+            <w:r>
+              <w:rPr>
+                <w:sz w:val="4"/>
+                <w:szCs w:val="4"/>
+              </w:rPr>
             </w:r>
           </w:p>
         </w:tc>
@@ -13296,7 +13876,7 @@
         <w:trPr/>
         <w:tc>
           <w:tcPr>
-            <w:tcW w:w="1228" w:type="dxa"/>
+            <w:tcW w:w="1208" w:type="dxa"/>
             <w:tcBorders/>
             <w:vAlign w:val="center"/>
           </w:tcPr>
@@ -13316,7 +13896,7 @@
         </w:tc>
         <w:tc>
           <w:tcPr>
-            <w:tcW w:w="5205" w:type="dxa"/>
+            <w:tcW w:w="5080" w:type="dxa"/>
             <w:tcBorders/>
             <w:vAlign w:val="center"/>
           </w:tcPr>
@@ -13339,6 +13919,106 @@
             <w:r>
               <w:rPr/>
               <w:t>`sim / \</w:t>
+            </w:r>
+          </w:p>
+        </w:tc>
+        <w:tc>
+          <w:tcPr>
+            <w:tcW w:w="317" w:type="dxa"/>
+            <w:tcBorders/>
+            <w:vAlign w:val="center"/>
+          </w:tcPr>
+          <w:p>
+            <w:pPr>
+              <w:pStyle w:val="Style14"/>
+              <w:bidi w:val="0"/>
+              <w:spacing w:before="0" w:after="283"/>
+              <w:jc w:val="left"/>
+              <w:rPr/>
+            </w:pPr>
+            <w:r>
+              <w:rPr/>
+              <w:t>b\</w:t>
+            </w:r>
+          </w:p>
+        </w:tc>
+        <w:tc>
+          <w:tcPr>
+            <w:tcW w:w="2671" w:type="dxa"/>
+            <w:tcBorders/>
+            <w:vAlign w:val="center"/>
+          </w:tcPr>
+          <w:p>
+            <w:pPr>
+              <w:pStyle w:val="Style14"/>
+              <w:bidi w:val="0"/>
+              <w:spacing w:before="0" w:after="283"/>
+              <w:jc w:val="left"/>
+              <w:rPr/>
+            </w:pPr>
+            <w:r>
+              <w:rPr/>
+              <w:t>^alpha`</w:t>
+            </w:r>
+            <w:r>
+              <w:rPr/>
+              <w:t>，</w:t>
+            </w:r>
+            <w:r>
+              <w:rPr/>
+              <w:t xml:space="preserve">`alpha &lt;= 0` </w:t>
+            </w:r>
+            <w:r>
+              <w:rPr/>
+              <w:t xml:space="preserve">或 </w:t>
+            </w:r>
+            <w:r>
+              <w:rPr/>
+              <w:t>`\</w:t>
+            </w:r>
+          </w:p>
+        </w:tc>
+        <w:tc>
+          <w:tcPr>
+            <w:tcW w:w="317" w:type="dxa"/>
+            <w:tcBorders/>
+            <w:vAlign w:val="center"/>
+          </w:tcPr>
+          <w:p>
+            <w:pPr>
+              <w:pStyle w:val="Style14"/>
+              <w:bidi w:val="0"/>
+              <w:spacing w:before="0" w:after="283"/>
+              <w:jc w:val="left"/>
+              <w:rPr/>
+            </w:pPr>
+            <w:r>
+              <w:rPr/>
+              <w:t>b\</w:t>
+            </w:r>
+          </w:p>
+        </w:tc>
+        <w:tc>
+          <w:tcPr>
+            <w:tcW w:w="1746" w:type="dxa"/>
+            <w:tcBorders/>
+            <w:vAlign w:val="center"/>
+          </w:tcPr>
+          <w:p>
+            <w:pPr>
+              <w:pStyle w:val="Style14"/>
+              <w:bidi w:val="0"/>
+              <w:spacing w:before="0" w:after="283"/>
+              <w:jc w:val="left"/>
+              <w:rPr/>
+            </w:pPr>
+            <w:r>
+              <w:rPr/>
+              <w:t xml:space="preserve">&lt;= 1` </w:t>
+            </w:r>
+            <w:r>
+              <w:rPr/>
+              <w:t>时原样返回</w:t>
             </w:r>
           </w:p>
         </w:tc>
@@ -16545,7 +17225,7 @@
     </w:p>
     <w:tbl>
       <w:tblPr>
-        <w:tblW w:w="5056" w:type="dxa"/>
+        <w:tblW w:w="10255" w:type="dxa"/>
         <w:jc w:val="left"/>
         <w:tblInd w:w="28" w:type="dxa"/>
         <w:tblLayout w:type="fixed"/>
@@ -16558,7 +17238,11 @@
       </w:tblPr>
       <w:tblGrid>
         <w:gridCol w:w="1495"/>
-        <w:gridCol w:w="3561"/>
+        <w:gridCol w:w="3516"/>
+        <w:gridCol w:w="789"/>
+        <w:gridCol w:w="3995"/>
+        <w:gridCol w:w="249"/>
+        <w:gridCol w:w="211"/>
       </w:tblGrid>
       <w:tr>
         <w:trPr/>
@@ -16586,7 +17270,7 @@
         </w:tc>
         <w:tc>
           <w:tcPr>
-            <w:tcW w:w="3561" w:type="dxa"/>
+            <w:tcW w:w="3516" w:type="dxa"/>
             <w:tcBorders/>
             <w:vAlign w:val="center"/>
           </w:tcPr>
@@ -16606,6 +17290,102 @@
             </w:r>
           </w:p>
         </w:tc>
+        <w:tc>
+          <w:tcPr>
+            <w:tcW w:w="789" w:type="dxa"/>
+            <w:tcBorders/>
+          </w:tcPr>
+          <w:p>
+            <w:pPr>
+              <w:pStyle w:val="Style14"/>
+              <w:bidi w:val="0"/>
+              <w:spacing w:before="0" w:after="283"/>
+              <w:jc w:val="left"/>
+              <w:rPr>
+                <w:sz w:val="4"/>
+                <w:szCs w:val="4"/>
+              </w:rPr>
+            </w:pPr>
+            <w:r>
+              <w:rPr>
+                <w:sz w:val="4"/>
+                <w:szCs w:val="4"/>
+              </w:rPr>
+            </w:r>
+          </w:p>
+        </w:tc>
+        <w:tc>
+          <w:tcPr>
+            <w:tcW w:w="3995" w:type="dxa"/>
+            <w:tcBorders/>
+          </w:tcPr>
+          <w:p>
+            <w:pPr>
+              <w:pStyle w:val="Style14"/>
+              <w:bidi w:val="0"/>
+              <w:spacing w:before="0" w:after="283"/>
+              <w:jc w:val="left"/>
+              <w:rPr>
+                <w:sz w:val="4"/>
+                <w:szCs w:val="4"/>
+              </w:rPr>
+            </w:pPr>
+            <w:r>
+              <w:rPr>
+                <w:sz w:val="4"/>
+                <w:szCs w:val="4"/>
+              </w:rPr>
+            </w:r>
+          </w:p>
+        </w:tc>
+        <w:tc>
+          <w:tcPr>
+            <w:tcW w:w="249" w:type="dxa"/>
+            <w:tcBorders/>
+          </w:tcPr>
+          <w:p>
+            <w:pPr>
+              <w:pStyle w:val="Style14"/>
+              <w:bidi w:val="0"/>
+              <w:spacing w:before="0" w:after="283"/>
+              <w:jc w:val="left"/>
+              <w:rPr>
+                <w:sz w:val="4"/>
+                <w:szCs w:val="4"/>
+              </w:rPr>
+            </w:pPr>
+            <w:r>
+              <w:rPr>
+                <w:sz w:val="4"/>
+                <w:szCs w:val="4"/>
+              </w:rPr>
+            </w:r>
+          </w:p>
+        </w:tc>
+        <w:tc>
+          <w:tcPr>
+            <w:tcW w:w="211" w:type="dxa"/>
+            <w:tcBorders/>
+          </w:tcPr>
+          <w:p>
+            <w:pPr>
+              <w:pStyle w:val="Style14"/>
+              <w:bidi w:val="0"/>
+              <w:spacing w:before="0" w:after="283"/>
+              <w:jc w:val="left"/>
+              <w:rPr>
+                <w:sz w:val="4"/>
+                <w:szCs w:val="4"/>
+              </w:rPr>
+            </w:pPr>
+            <w:r>
+              <w:rPr>
+                <w:sz w:val="4"/>
+                <w:szCs w:val="4"/>
+              </w:rPr>
+            </w:r>
+          </w:p>
+        </w:tc>
       </w:tr>
       <w:tr>
         <w:trPr/>
@@ -16631,7 +17411,7 @@
         </w:tc>
         <w:tc>
           <w:tcPr>
-            <w:tcW w:w="3561" w:type="dxa"/>
+            <w:tcW w:w="3516" w:type="dxa"/>
             <w:tcBorders/>
             <w:vAlign w:val="center"/>
           </w:tcPr>
@@ -16646,6 +17426,94 @@
             <w:r>
               <w:rPr/>
               <w:t>`(1/\</w:t>
+            </w:r>
+          </w:p>
+        </w:tc>
+        <w:tc>
+          <w:tcPr>
+            <w:tcW w:w="789" w:type="dxa"/>
+            <w:tcBorders/>
+            <w:vAlign w:val="center"/>
+          </w:tcPr>
+          <w:p>
+            <w:pPr>
+              <w:pStyle w:val="Style14"/>
+              <w:bidi w:val="0"/>
+              <w:spacing w:before="0" w:after="283"/>
+              <w:jc w:val="left"/>
+              <w:rPr/>
+            </w:pPr>
+            <w:r>
+              <w:rPr/>
+              <w:t>U\</w:t>
+            </w:r>
+          </w:p>
+        </w:tc>
+        <w:tc>
+          <w:tcPr>
+            <w:tcW w:w="3995" w:type="dxa"/>
+            <w:tcBorders/>
+            <w:vAlign w:val="center"/>
+          </w:tcPr>
+          <w:p>
+            <w:pPr>
+              <w:pStyle w:val="Style14"/>
+              <w:bidi w:val="0"/>
+              <w:spacing w:before="0" w:after="283"/>
+              <w:jc w:val="left"/>
+              <w:rPr/>
+            </w:pPr>
+            <w:r>
+              <w:rPr/>
+              <w:t>) Σ Precision(u)`</w:t>
+            </w:r>
+          </w:p>
+        </w:tc>
+        <w:tc>
+          <w:tcPr>
+            <w:tcW w:w="249" w:type="dxa"/>
+            <w:tcBorders/>
+          </w:tcPr>
+          <w:p>
+            <w:pPr>
+              <w:pStyle w:val="Style14"/>
+              <w:bidi w:val="0"/>
+              <w:spacing w:before="0" w:after="283"/>
+              <w:jc w:val="left"/>
+              <w:rPr>
+                <w:sz w:val="4"/>
+                <w:szCs w:val="4"/>
+              </w:rPr>
+            </w:pPr>
+            <w:r>
+              <w:rPr>
+                <w:sz w:val="4"/>
+                <w:szCs w:val="4"/>
+              </w:rPr>
+            </w:r>
+          </w:p>
+        </w:tc>
+        <w:tc>
+          <w:tcPr>
+            <w:tcW w:w="211" w:type="dxa"/>
+            <w:tcBorders/>
+          </w:tcPr>
+          <w:p>
+            <w:pPr>
+              <w:pStyle w:val="Style14"/>
+              <w:bidi w:val="0"/>
+              <w:spacing w:before="0" w:after="283"/>
+              <w:jc w:val="left"/>
+              <w:rPr>
+                <w:sz w:val="4"/>
+                <w:szCs w:val="4"/>
+              </w:rPr>
+            </w:pPr>
+            <w:r>
+              <w:rPr>
+                <w:sz w:val="4"/>
+                <w:szCs w:val="4"/>
+              </w:rPr>
             </w:r>
           </w:p>
         </w:tc>
@@ -16674,7 +17542,7 @@
         </w:tc>
         <w:tc>
           <w:tcPr>
-            <w:tcW w:w="3561" w:type="dxa"/>
+            <w:tcW w:w="3516" w:type="dxa"/>
             <w:tcBorders/>
             <w:vAlign w:val="center"/>
           </w:tcPr>
@@ -16689,6 +17557,94 @@
             <w:r>
               <w:rPr/>
               <w:t>`(1/\</w:t>
+            </w:r>
+          </w:p>
+        </w:tc>
+        <w:tc>
+          <w:tcPr>
+            <w:tcW w:w="789" w:type="dxa"/>
+            <w:tcBorders/>
+            <w:vAlign w:val="center"/>
+          </w:tcPr>
+          <w:p>
+            <w:pPr>
+              <w:pStyle w:val="Style14"/>
+              <w:bidi w:val="0"/>
+              <w:spacing w:before="0" w:after="283"/>
+              <w:jc w:val="left"/>
+              <w:rPr/>
+            </w:pPr>
+            <w:r>
+              <w:rPr/>
+              <w:t>U\</w:t>
+            </w:r>
+          </w:p>
+        </w:tc>
+        <w:tc>
+          <w:tcPr>
+            <w:tcW w:w="3995" w:type="dxa"/>
+            <w:tcBorders/>
+            <w:vAlign w:val="center"/>
+          </w:tcPr>
+          <w:p>
+            <w:pPr>
+              <w:pStyle w:val="Style14"/>
+              <w:bidi w:val="0"/>
+              <w:spacing w:before="0" w:after="283"/>
+              <w:jc w:val="left"/>
+              <w:rPr/>
+            </w:pPr>
+            <w:r>
+              <w:rPr/>
+              <w:t>) Σ Recall(u)`</w:t>
+            </w:r>
+          </w:p>
+        </w:tc>
+        <w:tc>
+          <w:tcPr>
+            <w:tcW w:w="249" w:type="dxa"/>
+            <w:tcBorders/>
+          </w:tcPr>
+          <w:p>
+            <w:pPr>
+              <w:pStyle w:val="Style14"/>
+              <w:bidi w:val="0"/>
+              <w:spacing w:before="0" w:after="283"/>
+              <w:jc w:val="left"/>
+              <w:rPr>
+                <w:sz w:val="4"/>
+                <w:szCs w:val="4"/>
+              </w:rPr>
+            </w:pPr>
+            <w:r>
+              <w:rPr>
+                <w:sz w:val="4"/>
+                <w:szCs w:val="4"/>
+              </w:rPr>
+            </w:r>
+          </w:p>
+        </w:tc>
+        <w:tc>
+          <w:tcPr>
+            <w:tcW w:w="211" w:type="dxa"/>
+            <w:tcBorders/>
+          </w:tcPr>
+          <w:p>
+            <w:pPr>
+              <w:pStyle w:val="Style14"/>
+              <w:bidi w:val="0"/>
+              <w:spacing w:before="0" w:after="283"/>
+              <w:jc w:val="left"/>
+              <w:rPr>
+                <w:sz w:val="4"/>
+                <w:szCs w:val="4"/>
+              </w:rPr>
+            </w:pPr>
+            <w:r>
+              <w:rPr>
+                <w:sz w:val="4"/>
+                <w:szCs w:val="4"/>
+              </w:rPr>
             </w:r>
           </w:p>
         </w:tc>
@@ -16717,7 +17673,7 @@
         </w:tc>
         <w:tc>
           <w:tcPr>
-            <w:tcW w:w="3561" w:type="dxa"/>
+            <w:tcW w:w="3516" w:type="dxa"/>
             <w:tcBorders/>
             <w:vAlign w:val="center"/>
           </w:tcPr>
@@ -16748,6 +17704,79 @@
             <w:r>
               <w:rPr/>
               <w:t>0</w:t>
+            </w:r>
+          </w:p>
+        </w:tc>
+        <w:tc>
+          <w:tcPr>
+            <w:tcW w:w="4784" w:type="dxa"/>
+            <w:gridSpan w:val="2"/>
+            <w:tcBorders/>
+          </w:tcPr>
+          <w:p>
+            <w:pPr>
+              <w:pStyle w:val="Style14"/>
+              <w:bidi w:val="0"/>
+              <w:spacing w:before="0" w:after="283"/>
+              <w:jc w:val="left"/>
+              <w:rPr>
+                <w:sz w:val="4"/>
+                <w:szCs w:val="4"/>
+              </w:rPr>
+            </w:pPr>
+            <w:r>
+              <w:rPr>
+                <w:sz w:val="4"/>
+                <w:szCs w:val="4"/>
+              </w:rPr>
+            </w:r>
+          </w:p>
+        </w:tc>
+        <w:tc>
+          <w:tcPr>
+            <w:tcW w:w="249" w:type="dxa"/>
+            <w:tcBorders/>
+          </w:tcPr>
+          <w:p>
+            <w:pPr>
+              <w:pStyle w:val="Style14"/>
+              <w:bidi w:val="0"/>
+              <w:spacing w:before="0" w:after="283"/>
+              <w:jc w:val="left"/>
+              <w:rPr>
+                <w:sz w:val="4"/>
+                <w:szCs w:val="4"/>
+              </w:rPr>
+            </w:pPr>
+            <w:r>
+              <w:rPr>
+                <w:sz w:val="4"/>
+                <w:szCs w:val="4"/>
+              </w:rPr>
+            </w:r>
+          </w:p>
+        </w:tc>
+        <w:tc>
+          <w:tcPr>
+            <w:tcW w:w="211" w:type="dxa"/>
+            <w:tcBorders/>
+          </w:tcPr>
+          <w:p>
+            <w:pPr>
+              <w:pStyle w:val="Style14"/>
+              <w:bidi w:val="0"/>
+              <w:spacing w:before="0" w:after="283"/>
+              <w:jc w:val="left"/>
+              <w:rPr>
+                <w:sz w:val="4"/>
+                <w:szCs w:val="4"/>
+              </w:rPr>
+            </w:pPr>
+            <w:r>
+              <w:rPr>
+                <w:sz w:val="4"/>
+                <w:szCs w:val="4"/>
+              </w:rPr>
             </w:r>
           </w:p>
         </w:tc>
@@ -16776,7 +17805,7 @@
         </w:tc>
         <w:tc>
           <w:tcPr>
-            <w:tcW w:w="3561" w:type="dxa"/>
+            <w:tcW w:w="3516" w:type="dxa"/>
             <w:tcBorders/>
             <w:vAlign w:val="center"/>
           </w:tcPr>
@@ -16791,6 +17820,90 @@
             <w:r>
               <w:rPr/>
               <w:t>`\</w:t>
+            </w:r>
+          </w:p>
+        </w:tc>
+        <w:tc>
+          <w:tcPr>
+            <w:tcW w:w="789" w:type="dxa"/>
+            <w:tcBorders/>
+            <w:vAlign w:val="center"/>
+          </w:tcPr>
+          <w:p>
+            <w:pPr>
+              <w:pStyle w:val="Style14"/>
+              <w:bidi w:val="0"/>
+              <w:spacing w:before="0" w:after="283"/>
+              <w:jc w:val="left"/>
+              <w:rPr/>
+            </w:pPr>
+            <w:r>
+              <w:rPr/>
+              <w:t>∪</w:t>
+            </w:r>
+            <w:r>
+              <w:rPr/>
+              <w:t>R(u)\</w:t>
+            </w:r>
+          </w:p>
+        </w:tc>
+        <w:tc>
+          <w:tcPr>
+            <w:tcW w:w="3995" w:type="dxa"/>
+            <w:tcBorders/>
+            <w:vAlign w:val="center"/>
+          </w:tcPr>
+          <w:p>
+            <w:pPr>
+              <w:pStyle w:val="Style14"/>
+              <w:bidi w:val="0"/>
+              <w:spacing w:before="0" w:after="283"/>
+              <w:jc w:val="left"/>
+              <w:rPr/>
+            </w:pPr>
+            <w:r>
+              <w:rPr/>
+              <w:t>/ \</w:t>
+            </w:r>
+          </w:p>
+        </w:tc>
+        <w:tc>
+          <w:tcPr>
+            <w:tcW w:w="249" w:type="dxa"/>
+            <w:tcBorders/>
+            <w:vAlign w:val="center"/>
+          </w:tcPr>
+          <w:p>
+            <w:pPr>
+              <w:pStyle w:val="Style14"/>
+              <w:bidi w:val="0"/>
+              <w:spacing w:before="0" w:after="283"/>
+              <w:jc w:val="left"/>
+              <w:rPr/>
+            </w:pPr>
+            <w:r>
+              <w:rPr/>
+              <w:t>I\</w:t>
+            </w:r>
+          </w:p>
+        </w:tc>
+        <w:tc>
+          <w:tcPr>
+            <w:tcW w:w="211" w:type="dxa"/>
+            <w:tcBorders/>
+            <w:vAlign w:val="center"/>
+          </w:tcPr>
+          <w:p>
+            <w:pPr>
+              <w:pStyle w:val="Style14"/>
+              <w:bidi w:val="0"/>
+              <w:spacing w:before="0" w:after="283"/>
+              <w:jc w:val="left"/>
+              <w:rPr/>
+            </w:pPr>
+            <w:r>
+              <w:rPr/>
+              <w:t>`</w:t>
             </w:r>
           </w:p>
         </w:tc>
@@ -16819,7 +17932,7 @@
         </w:tc>
         <w:tc>
           <w:tcPr>
-            <w:tcW w:w="3561" w:type="dxa"/>
+            <w:tcW w:w="3516" w:type="dxa"/>
             <w:tcBorders/>
             <w:vAlign w:val="center"/>
           </w:tcPr>
@@ -16834,6 +17947,75 @@
             <w:r>
               <w:rPr/>
               <w:t>`(1/Σ\</w:t>
+            </w:r>
+          </w:p>
+        </w:tc>
+        <w:tc>
+          <w:tcPr>
+            <w:tcW w:w="789" w:type="dxa"/>
+            <w:tcBorders/>
+            <w:vAlign w:val="center"/>
+          </w:tcPr>
+          <w:p>
+            <w:pPr>
+              <w:pStyle w:val="Style14"/>
+              <w:bidi w:val="0"/>
+              <w:spacing w:before="0" w:after="283"/>
+              <w:jc w:val="left"/>
+              <w:rPr/>
+            </w:pPr>
+            <w:r>
+              <w:rPr/>
+              <w:t>R(u)\</w:t>
+            </w:r>
+          </w:p>
+        </w:tc>
+        <w:tc>
+          <w:tcPr>
+            <w:tcW w:w="3995" w:type="dxa"/>
+            <w:tcBorders/>
+            <w:vAlign w:val="center"/>
+          </w:tcPr>
+          <w:p>
+            <w:pPr>
+              <w:pStyle w:val="Style14"/>
+              <w:bidi w:val="0"/>
+              <w:spacing w:before="0" w:after="283"/>
+              <w:jc w:val="left"/>
+              <w:rPr/>
+            </w:pPr>
+            <w:r>
+              <w:rPr/>
+              <w:t>) Σ ln(1 + popularity(i))`</w:t>
+            </w:r>
+            <w:r>
+              <w:rPr/>
+              <w:t>，越小越能挖长尾</w:t>
+            </w:r>
+          </w:p>
+        </w:tc>
+        <w:tc>
+          <w:tcPr>
+            <w:tcW w:w="460" w:type="dxa"/>
+            <w:gridSpan w:val="2"/>
+            <w:tcBorders/>
+          </w:tcPr>
+          <w:p>
+            <w:pPr>
+              <w:pStyle w:val="Style14"/>
+              <w:bidi w:val="0"/>
+              <w:spacing w:before="0" w:after="283"/>
+              <w:jc w:val="left"/>
+              <w:rPr>
+                <w:sz w:val="4"/>
+                <w:szCs w:val="4"/>
+              </w:rPr>
+            </w:pPr>
+            <w:r>
+              <w:rPr>
+                <w:sz w:val="4"/>
+                <w:szCs w:val="4"/>
+              </w:rPr>
             </w:r>
           </w:p>
         </w:tc>
@@ -31761,36 +32943,555 @@
           <w:tab w:val="left" w:pos="709" w:leader="none"/>
         </w:tabs>
         <w:bidi w:val="0"/>
+        <w:ind w:hanging="283" w:left="709"/>
+        <w:jc w:val="left"/>
+        <w:rPr/>
+      </w:pPr>
+      <w:r>
+        <w:rPr>
+          <w:b/>
+        </w:rPr>
+        <w:t>冷商品</w:t>
+      </w:r>
+      <w:r>
+        <w:rPr/>
+        <w:t>（零交互）：</w:t>
+      </w:r>
+      <w:r>
+        <w:rPr/>
+        <w:t xml:space="preserve">ItemCF </w:t>
+      </w:r>
+      <w:r>
+        <w:rPr/>
+        <w:t xml:space="preserve">无从下手。引擎原会用全站热门补满结果，导致品类补位无法触发；新增 </w:t>
+      </w:r>
+      <w:r>
+        <w:rPr/>
+        <w:t xml:space="preserve">`recommendSimilarRaw` </w:t>
+      </w:r>
+      <w:r>
+        <w:rPr/>
+        <w:t xml:space="preserve">关闭该补位，由服务层按「同品类热门商品」补位（理由：同品类热门商品），全局热门只作最后兜底。 </w:t>
+      </w:r>
+    </w:p>
+    <w:p>
+      <w:pPr>
+        <w:pStyle w:val="Heading3"/>
+        <w:bidi w:val="0"/>
+        <w:jc w:val="left"/>
+        <w:rPr/>
+      </w:pPr>
+      <w:r>
+        <w:rPr/>
+        <w:t xml:space="preserve">15.11 </w:t>
+      </w:r>
+      <w:r>
+        <w:rPr/>
+        <w:t>认证增强：服务端注销与修改密码</w:t>
+      </w:r>
+    </w:p>
+    <w:p>
+      <w:pPr>
+        <w:pStyle w:val="BodyText"/>
+        <w:bidi w:val="0"/>
+        <w:jc w:val="left"/>
+        <w:rPr/>
+      </w:pPr>
+      <w:r>
+        <w:rPr>
+          <w:b/>
+        </w:rPr>
+        <w:t>服务端注销（</w:t>
+      </w:r>
+      <w:r>
+        <w:rPr>
+          <w:b/>
+        </w:rPr>
+        <w:t>F1.3</w:t>
+      </w:r>
+      <w:r>
+        <w:rPr>
+          <w:b/>
+        </w:rPr>
+        <w:t>）</w:t>
+      </w:r>
+      <w:r>
+        <w:rPr/>
+        <w:t>。</w:t>
+      </w:r>
+      <w:r>
+        <w:rPr/>
+        <w:t xml:space="preserve">JWT </w:t>
+      </w:r>
+      <w:r>
+        <w:rPr/>
+        <w:t xml:space="preserve">的固有问题是「签出去就收不回」：前端删掉令牌只是本机忘了它，令牌本身在 </w:t>
+      </w:r>
+      <w:r>
+        <w:rPr/>
+        <w:t xml:space="preserve">24h </w:t>
+      </w:r>
+      <w:r>
+        <w:rPr/>
+        <w:t>内仍然可用，被复制走的令牌照旧能访问。</w:t>
+      </w:r>
+    </w:p>
+    <w:p>
+      <w:pPr>
+        <w:pStyle w:val="BodyText"/>
+        <w:bidi w:val="0"/>
+        <w:jc w:val="left"/>
+        <w:rPr/>
+      </w:pPr>
+      <w:r>
+        <w:rPr/>
+        <w:t>解决方式是令牌黑名单，三个关键取舍：</w:t>
+      </w:r>
+    </w:p>
+    <w:tbl>
+      <w:tblPr>
+        <w:tblW w:w="10799" w:type="dxa"/>
+        <w:jc w:val="left"/>
+        <w:tblInd w:w="28" w:type="dxa"/>
+        <w:tblLayout w:type="fixed"/>
+        <w:tblCellMar>
+          <w:top w:w="28" w:type="dxa"/>
+          <w:left w:w="28" w:type="dxa"/>
+          <w:bottom w:w="28" w:type="dxa"/>
+          <w:right w:w="28" w:type="dxa"/>
+        </w:tblCellMar>
+      </w:tblPr>
+      <w:tblGrid>
+        <w:gridCol w:w="2146"/>
+        <w:gridCol w:w="1126"/>
+        <w:gridCol w:w="7527"/>
+      </w:tblGrid>
+      <w:tr>
+        <w:trPr/>
+        <w:tc>
+          <w:tcPr>
+            <w:tcW w:w="2146" w:type="dxa"/>
+            <w:tcBorders/>
+            <w:vAlign w:val="center"/>
+          </w:tcPr>
+          <w:p>
+            <w:pPr>
+              <w:pStyle w:val="Style19"/>
+              <w:suppressLineNumbers/>
+              <w:shd w:fill="EEF1F4" w:val="clear"/>
+              <w:bidi w:val="0"/>
+              <w:spacing w:before="0" w:after="283"/>
+              <w:jc w:val="left"/>
+              <w:rPr/>
+            </w:pPr>
+            <w:r>
+              <w:rPr/>
+              <w:t>决策</w:t>
+            </w:r>
+          </w:p>
+        </w:tc>
+        <w:tc>
+          <w:tcPr>
+            <w:tcW w:w="1126" w:type="dxa"/>
+            <w:tcBorders/>
+            <w:vAlign w:val="center"/>
+          </w:tcPr>
+          <w:p>
+            <w:pPr>
+              <w:pStyle w:val="Style19"/>
+              <w:suppressLineNumbers/>
+              <w:shd w:fill="EEF1F4" w:val="clear"/>
+              <w:bidi w:val="0"/>
+              <w:spacing w:before="0" w:after="283"/>
+              <w:jc w:val="left"/>
+              <w:rPr/>
+            </w:pPr>
+            <w:r>
+              <w:rPr/>
+              <w:t>备选</w:t>
+            </w:r>
+          </w:p>
+        </w:tc>
+        <w:tc>
+          <w:tcPr>
+            <w:tcW w:w="7527" w:type="dxa"/>
+            <w:tcBorders/>
+            <w:vAlign w:val="center"/>
+          </w:tcPr>
+          <w:p>
+            <w:pPr>
+              <w:pStyle w:val="Style19"/>
+              <w:suppressLineNumbers/>
+              <w:shd w:fill="EEF1F4" w:val="clear"/>
+              <w:bidi w:val="0"/>
+              <w:spacing w:before="0" w:after="283"/>
+              <w:jc w:val="left"/>
+              <w:rPr/>
+            </w:pPr>
+            <w:r>
+              <w:rPr/>
+              <w:t>理由</w:t>
+            </w:r>
+          </w:p>
+        </w:tc>
+      </w:tr>
+      <w:tr>
+        <w:trPr/>
+        <w:tc>
+          <w:tcPr>
+            <w:tcW w:w="2146" w:type="dxa"/>
+            <w:tcBorders/>
+            <w:vAlign w:val="center"/>
+          </w:tcPr>
+          <w:p>
+            <w:pPr>
+              <w:pStyle w:val="Style14"/>
+              <w:bidi w:val="0"/>
+              <w:spacing w:before="0" w:after="283"/>
+              <w:jc w:val="left"/>
+              <w:rPr/>
+            </w:pPr>
+            <w:r>
+              <w:rPr/>
+              <w:t xml:space="preserve">落库 </w:t>
+            </w:r>
+            <w:r>
+              <w:rPr/>
+              <w:t>`revoked_token`</w:t>
+            </w:r>
+          </w:p>
+        </w:tc>
+        <w:tc>
+          <w:tcPr>
+            <w:tcW w:w="1126" w:type="dxa"/>
+            <w:tcBorders/>
+            <w:vAlign w:val="center"/>
+          </w:tcPr>
+          <w:p>
+            <w:pPr>
+              <w:pStyle w:val="Style14"/>
+              <w:bidi w:val="0"/>
+              <w:spacing w:before="0" w:after="283"/>
+              <w:jc w:val="left"/>
+              <w:rPr/>
+            </w:pPr>
+            <w:r>
+              <w:rPr/>
+              <w:t>纯内存</w:t>
+            </w:r>
+          </w:p>
+        </w:tc>
+        <w:tc>
+          <w:tcPr>
+            <w:tcW w:w="7527" w:type="dxa"/>
+            <w:tcBorders/>
+            <w:vAlign w:val="center"/>
+          </w:tcPr>
+          <w:p>
+            <w:pPr>
+              <w:pStyle w:val="Style14"/>
+              <w:bidi w:val="0"/>
+              <w:spacing w:before="0" w:after="283"/>
+              <w:jc w:val="left"/>
+              <w:rPr/>
+            </w:pPr>
+            <w:r>
+              <w:rPr/>
+              <w:t>纯内存在重启后清空，已注销令牌会「复活」到过期为止——安全状态不能这样丢</w:t>
+            </w:r>
+          </w:p>
+        </w:tc>
+      </w:tr>
+      <w:tr>
+        <w:trPr/>
+        <w:tc>
+          <w:tcPr>
+            <w:tcW w:w="2146" w:type="dxa"/>
+            <w:tcBorders/>
+            <w:vAlign w:val="center"/>
+          </w:tcPr>
+          <w:p>
+            <w:pPr>
+              <w:pStyle w:val="Style14"/>
+              <w:bidi w:val="0"/>
+              <w:spacing w:before="0" w:after="283"/>
+              <w:jc w:val="left"/>
+              <w:rPr/>
+            </w:pPr>
+            <w:r>
+              <w:rPr/>
+              <w:t xml:space="preserve">内存缓存 </w:t>
+            </w:r>
+            <w:r>
+              <w:rPr/>
+              <w:t xml:space="preserve">+ </w:t>
+            </w:r>
+            <w:r>
+              <w:rPr/>
+              <w:t>懒加载</w:t>
+            </w:r>
+          </w:p>
+        </w:tc>
+        <w:tc>
+          <w:tcPr>
+            <w:tcW w:w="1126" w:type="dxa"/>
+            <w:tcBorders/>
+            <w:vAlign w:val="center"/>
+          </w:tcPr>
+          <w:p>
+            <w:pPr>
+              <w:pStyle w:val="Style14"/>
+              <w:bidi w:val="0"/>
+              <w:spacing w:before="0" w:after="283"/>
+              <w:jc w:val="left"/>
+              <w:rPr/>
+            </w:pPr>
+            <w:r>
+              <w:rPr/>
+              <w:t>每请求查库</w:t>
+            </w:r>
+          </w:p>
+        </w:tc>
+        <w:tc>
+          <w:tcPr>
+            <w:tcW w:w="7527" w:type="dxa"/>
+            <w:tcBorders/>
+            <w:vAlign w:val="center"/>
+          </w:tcPr>
+          <w:p>
+            <w:pPr>
+              <w:pStyle w:val="Style14"/>
+              <w:bidi w:val="0"/>
+              <w:spacing w:before="0" w:after="283"/>
+              <w:jc w:val="left"/>
+              <w:rPr/>
+            </w:pPr>
+            <w:r>
+              <w:rPr/>
+              <w:t xml:space="preserve">落库保证正确性，缓存保证过滤器仍然零 </w:t>
+            </w:r>
+            <w:r>
+              <w:rPr/>
+              <w:t>IO</w:t>
+            </w:r>
+            <w:r>
+              <w:rPr/>
+              <w:t>；单机场景两者必然一致</w:t>
+            </w:r>
+          </w:p>
+        </w:tc>
+      </w:tr>
+      <w:tr>
+        <w:trPr/>
+        <w:tc>
+          <w:tcPr>
+            <w:tcW w:w="2146" w:type="dxa"/>
+            <w:tcBorders/>
+            <w:vAlign w:val="center"/>
+          </w:tcPr>
+          <w:p>
+            <w:pPr>
+              <w:pStyle w:val="Style14"/>
+              <w:bidi w:val="0"/>
+              <w:spacing w:before="0" w:after="283"/>
+              <w:jc w:val="left"/>
+              <w:rPr/>
+            </w:pPr>
+            <w:r>
+              <w:rPr/>
+              <w:t xml:space="preserve">存 </w:t>
+            </w:r>
+            <w:r>
+              <w:rPr/>
+              <w:t xml:space="preserve">SHA-256 </w:t>
+            </w:r>
+            <w:r>
+              <w:rPr/>
+              <w:t>摘要</w:t>
+            </w:r>
+          </w:p>
+        </w:tc>
+        <w:tc>
+          <w:tcPr>
+            <w:tcW w:w="1126" w:type="dxa"/>
+            <w:tcBorders/>
+            <w:vAlign w:val="center"/>
+          </w:tcPr>
+          <w:p>
+            <w:pPr>
+              <w:pStyle w:val="Style14"/>
+              <w:bidi w:val="0"/>
+              <w:spacing w:before="0" w:after="283"/>
+              <w:jc w:val="left"/>
+              <w:rPr/>
+            </w:pPr>
+            <w:r>
+              <w:rPr/>
+              <w:t>存原令牌</w:t>
+            </w:r>
+          </w:p>
+        </w:tc>
+        <w:tc>
+          <w:tcPr>
+            <w:tcW w:w="7527" w:type="dxa"/>
+            <w:tcBorders/>
+            <w:vAlign w:val="center"/>
+          </w:tcPr>
+          <w:p>
+            <w:pPr>
+              <w:pStyle w:val="Style14"/>
+              <w:bidi w:val="0"/>
+              <w:spacing w:before="0" w:after="283"/>
+              <w:jc w:val="left"/>
+              <w:rPr/>
+            </w:pPr>
+            <w:r>
+              <w:rPr/>
+              <w:t>库泄露时无法据此伪造或复用令牌</w:t>
+            </w:r>
+          </w:p>
+        </w:tc>
+      </w:tr>
+    </w:tbl>
+    <w:p>
+      <w:pPr>
+        <w:pStyle w:val="BodyText"/>
+        <w:bidi w:val="0"/>
+        <w:jc w:val="left"/>
+        <w:rPr/>
+      </w:pPr>
+      <w:r>
+        <w:rPr/>
+        <w:t xml:space="preserve">过滤器命中黑名单时不再建立安全上下文，后续按未登录处理（业务码 </w:t>
+      </w:r>
+      <w:r>
+        <w:rPr/>
+        <w:t>1002</w:t>
+      </w:r>
+      <w:r>
+        <w:rPr/>
+        <w:t xml:space="preserve">）。注销接口幂等且宽容：没带令牌、令牌已过期、重复注销都返回成功——用户点退出不该看到报错。清理任务按 </w:t>
+      </w:r>
+      <w:r>
+        <w:rPr/>
+        <w:t xml:space="preserve">`expire_at` </w:t>
+      </w:r>
+      <w:r>
+        <w:rPr/>
+        <w:t>删除过期行；判断时也校验过期时间，因此清理频率不影响正确性。</w:t>
+      </w:r>
+    </w:p>
+    <w:p>
+      <w:pPr>
+        <w:pStyle w:val="BodyText"/>
+        <w:bidi w:val="0"/>
+        <w:jc w:val="left"/>
+        <w:rPr/>
+      </w:pPr>
+      <w:r>
+        <w:rPr>
+          <w:b/>
+        </w:rPr>
+        <w:t>修改密码（</w:t>
+      </w:r>
+      <w:r>
+        <w:rPr>
+          <w:b/>
+        </w:rPr>
+        <w:t>F1.4</w:t>
+      </w:r>
+      <w:r>
+        <w:rPr>
+          <w:b/>
+        </w:rPr>
+        <w:t>）</w:t>
+      </w:r>
+      <w:r>
+        <w:rPr/>
+        <w:t>。</w:t>
+      </w:r>
+      <w:r>
+        <w:rPr/>
+        <w:t>`PUT /api/user/password`</w:t>
+      </w:r>
+      <w:r>
+        <w:rPr/>
+        <w:t>，必须校验原密码：持有令牌只证明「这个会话是你的」，不证明「你知道密码」；否则令牌一旦泄露，攻击者可以改密把真正的用户锁在门外。</w:t>
+      </w:r>
+    </w:p>
+    <w:p>
+      <w:pPr>
+        <w:pStyle w:val="BodyText"/>
+        <w:bidi w:val="0"/>
+        <w:jc w:val="left"/>
+        <w:rPr/>
+      </w:pPr>
+      <w:r>
+        <w:rPr/>
+        <w:t xml:space="preserve">服务端强制三条约束（不只依赖表单）：原密码正确、新密码 </w:t>
+      </w:r>
+      <w:r>
+        <w:rPr/>
+        <w:t xml:space="preserve">6~20 </w:t>
+      </w:r>
+      <w:r>
+        <w:rPr/>
+        <w:t>位、新旧不得相同。成功后</w:t>
+      </w:r>
+      <w:r>
+        <w:rPr>
+          <w:b/>
+        </w:rPr>
+        <w:t>把当前令牌加入黑名单</w:t>
+      </w:r>
+      <w:r>
+        <w:rPr/>
+        <w:t>，让发起改密的会话立即失效，前端随后清空本地状态并回登录页。</w:t>
+      </w:r>
+    </w:p>
+    <w:p>
+      <w:pPr>
+        <w:pStyle w:val="BodyText"/>
+        <w:bidi w:val="0"/>
         <w:spacing w:before="0" w:after="283"/>
-        <w:ind w:hanging="283" w:left="709"/>
-        <w:jc w:val="left"/>
-        <w:rPr/>
-      </w:pPr>
-      <w:r>
-        <w:rPr>
-          <w:b/>
-        </w:rPr>
-        <w:t>冷商品</w:t>
-      </w:r>
-      <w:r>
-        <w:rPr/>
-        <w:t>（零交互）：</w:t>
-      </w:r>
-      <w:r>
-        <w:rPr/>
-        <w:t xml:space="preserve">ItemCF </w:t>
-      </w:r>
-      <w:r>
-        <w:rPr/>
-        <w:t xml:space="preserve">无从下手。引擎原会用全站热门补满结果，导致品类补位无法触发；新增 </w:t>
-      </w:r>
-      <w:r>
-        <w:rPr/>
-        <w:t xml:space="preserve">`recommendSimilarRaw` </w:t>
-      </w:r>
-      <w:r>
-        <w:rPr/>
-        <w:t xml:space="preserve">关闭该补位，由服务层按「同品类热门商品」补位（理由：同品类热门商品），全局热门只作最后兜底。 </w:t>
+        <w:jc w:val="left"/>
+        <w:rPr/>
+      </w:pPr>
+      <w:r>
+        <w:rPr/>
+        <w:t>已知缺口：其他设备的令牌仍有效至各自过期（≤</w:t>
+      </w:r>
+      <w:r>
+        <w:rPr/>
+        <w:t>24h</w:t>
+      </w:r>
+      <w:r>
+        <w:rPr/>
+        <w:t xml:space="preserve">）。要「全端下线」需在 </w:t>
+      </w:r>
+      <w:r>
+        <w:rPr/>
+        <w:t xml:space="preserve">`user` </w:t>
+      </w:r>
+      <w:r>
+        <w:rPr/>
+        <w:t xml:space="preserve">表加 </w:t>
+      </w:r>
+      <w:r>
+        <w:rPr/>
+        <w:t>`password_changed_at`</w:t>
+      </w:r>
+      <w:r>
+        <w:rPr/>
+        <w:t xml:space="preserve">，过滤器比对令牌 </w:t>
+      </w:r>
+      <w:r>
+        <w:rPr/>
+        <w:t xml:space="preserve">`iat` </w:t>
+      </w:r>
+      <w:r>
+        <w:rPr/>
+        <w:t>是否早于它——代价是过滤器需要读用户行，与「不查库」的设计相冲突，故暂不采用。</w:t>
       </w:r>
     </w:p>
     <w:sectPr>
@@ -34896,7 +36597,7 @@
       <w:spacing w:lineRule="auto" w:line="384"/>
     </w:pPr>
     <w:rPr>
-      <w:rFonts w:ascii="Microsoft YaHei;SimSun;sans-serif" w:hAnsi="Microsoft YaHei;SimSun;sans-serif" w:eastAsia="Microsoft YaHei;SimSun;sans-serif" w:cs="Microsoft YaHei;SimSun;sans-serif"/>
+      <w:rFonts w:ascii="Microsoft YaHei;Microsoft YaHei;SimSun;sans-serif" w:hAnsi="Microsoft YaHei;Microsoft YaHei;SimSun;sans-serif" w:eastAsia="Microsoft YaHei;Microsoft YaHei;SimSun;sans-serif" w:cs="Microsoft YaHei;Microsoft YaHei;SimSun;sans-serif"/>
       <w:color w:val="24292F"/>
       <w:sz w:val="22"/>
       <w:szCs w:val="22"/>
@@ -34970,8 +36671,8 @@
       <w:rFonts w:ascii="Liberation Serif" w:hAnsi="Liberation Serif" w:eastAsia="新宋体" w:cs="Lucida Sans"/>
       <w:b/>
       <w:bCs/>
-      <w:sz w:val="23"/>
-      <w:szCs w:val="23"/>
+      <w:sz w:val="24"/>
+      <w:szCs w:val="24"/>
     </w:rPr>
   </w:style>
   <w:style w:type="paragraph" w:styleId="Heading5">
@@ -34987,8 +36688,8 @@
       <w:rFonts w:ascii="Liberation Serif" w:hAnsi="Liberation Serif" w:eastAsia="新宋体" w:cs="Lucida Sans"/>
       <w:b/>
       <w:bCs/>
-      <w:sz w:val="23"/>
-      <w:szCs w:val="23"/>
+      <w:sz w:val="24"/>
+      <w:szCs w:val="24"/>
     </w:rPr>
   </w:style>
   <w:style w:type="paragraph" w:styleId="Heading6">
@@ -35004,8 +36705,8 @@
       <w:rFonts w:ascii="Liberation Serif" w:hAnsi="Liberation Serif" w:eastAsia="新宋体" w:cs="Lucida Sans"/>
       <w:b/>
       <w:bCs/>
-      <w:sz w:val="23"/>
-      <w:szCs w:val="23"/>
+      <w:sz w:val="24"/>
+      <w:szCs w:val="24"/>
     </w:rPr>
   </w:style>
   <w:style w:type="character" w:styleId="EndnoteReference">

</xml_diff>